<commit_message>
Add live app link, deployment and MLOps section; mark bonus points done
</commit_message>
<xml_diff>
--- a/Report.docx
+++ b/Report.docx
@@ -18,7 +18,7 @@
         <w:t xml:space="preserve">IT5514 Applied Machine Learning - Assignment 02</w:t>
       </w:r>
     </w:p>
-    <w:bookmarkStart w:id="75" w:name="X690cb1a665f3cc29abf91da31156672617c256e"/>
+    <w:bookmarkStart w:id="76" w:name="X690cb1a665f3cc29abf91da31156672617c256e"/>
     <w:p>
       <w:pPr>
         <w:pStyle w:val="Heading1"/>
@@ -253,6 +253,24 @@
       </w:r>
       <w:r>
         <w:t xml:space="preserve">front-end application that loads the saved (pickled) model.</w:t>
+      </w:r>
+    </w:p>
+    <w:p>
+      <w:pPr>
+        <w:pStyle w:val="Compact"/>
+        <w:numPr>
+          <w:ilvl w:val="0"/>
+          <w:numId w:val="1001"/>
+        </w:numPr>
+      </w:pPr>
+      <w:r>
+        <w:t xml:space="preserve">The project was published to a GitHub repository with an automated MLOps pipeline (retraining, quality gate,</w:t>
+      </w:r>
+      <w:r>
+        <w:t xml:space="preserve"> </w:t>
+      </w:r>
+      <w:r>
+        <w:t xml:space="preserve">tests and continuous integration), and the application was deployed online.</w:t>
       </w:r>
     </w:p>
     <w:p>
@@ -8215,7 +8233,7 @@
     </w:p>
     <w:bookmarkEnd w:id="66"/>
     <w:bookmarkEnd w:id="67"/>
-    <w:bookmarkStart w:id="70" w:name="inference-and-application"/>
+    <w:bookmarkStart w:id="71" w:name="inference-and-application"/>
     <w:p>
       <w:pPr>
         <w:pStyle w:val="Heading2"/>
@@ -8755,7 +8773,7 @@
         <w:pStyle w:val="BodyText"/>
       </w:pPr>
       <w:r>
-        <w:t xml:space="preserve">To run the application:</w:t>
+        <w:t xml:space="preserve">To run the application locally:</w:t>
       </w:r>
       <w:r>
         <w:t xml:space="preserve"> </w:t>
@@ -8764,7 +8782,7 @@
         <w:rPr>
           <w:rStyle w:val="VerbatimChar"/>
         </w:rPr>
-        <w:t xml:space="preserve">pip install streamlit scikit-learn xgboost catboost pandas</w:t>
+        <w:t xml:space="preserve">pip install -r requirements.txt</w:t>
       </w:r>
       <w:r>
         <w:t xml:space="preserve">, then</w:t>
@@ -8797,25 +8815,127 @@
         <w:t xml:space="preserve"> </w:t>
       </w:r>
       <w:r>
-        <w:t xml:space="preserve">folder.</w:t>
-      </w:r>
-    </w:p>
-    <w:p>
-      <w:r>
-        <w:pict>
-          <v:rect style="width:0;height:1.5pt" o:hralign="center" o:hrstd="t" o:hr="t"/>
-        </w:pict>
+        <w:t xml:space="preserve">folder. It is also deployed online (Section 7.3).</w:t>
       </w:r>
     </w:p>
     <w:bookmarkEnd w:id="69"/>
-    <w:bookmarkEnd w:id="70"/>
-    <w:bookmarkStart w:id="71" w:name="limitations-and-future-work"/>
-    <w:p>
-      <w:pPr>
-        <w:pStyle w:val="Heading2"/>
-      </w:pPr>
-      <w:r>
-        <w:t xml:space="preserve">8. Limitations and Future Work</w:t>
+    <w:bookmarkStart w:id="70" w:name="repository-deployment-and-mlops"/>
+    <w:p>
+      <w:pPr>
+        <w:pStyle w:val="Heading3"/>
+      </w:pPr>
+      <w:r>
+        <w:t xml:space="preserve">7.3 Repository, deployment and MLOps</w:t>
+      </w:r>
+    </w:p>
+    <w:p>
+      <w:pPr>
+        <w:pStyle w:val="FirstParagraph"/>
+      </w:pPr>
+      <w:r>
+        <w:t xml:space="preserve">The project is published in a private GitHub repository (github.com/amalr-12/colombo-land-price-ml) and the</w:t>
+      </w:r>
+      <w:r>
+        <w:t xml:space="preserve"> </w:t>
+      </w:r>
+      <w:r>
+        <w:t xml:space="preserve">application is deployed on Streamlit Community Cloud:</w:t>
+      </w:r>
+    </w:p>
+    <w:p>
+      <w:pPr>
+        <w:pStyle w:val="BodyText"/>
+      </w:pPr>
+      <w:r>
+        <w:rPr>
+          <w:b/>
+          <w:bCs/>
+        </w:rPr>
+        <w:t xml:space="preserve">Live application:</w:t>
+      </w:r>
+      <w:r>
+        <w:t xml:space="preserve"> </w:t>
+      </w:r>
+      <w:r>
+        <w:t xml:space="preserve">https://colombo-land-price-ml-5jekcfuzve5ezgfgjjpqoh.streamlit.app</w:t>
+      </w:r>
+    </w:p>
+    <w:p>
+      <w:pPr>
+        <w:pStyle w:val="BodyText"/>
+      </w:pPr>
+      <w:r>
+        <w:t xml:space="preserve">The deployed app gives exactly the same predictions as the local model (for example, a 10-perch residential plot</w:t>
+      </w:r>
+      <w:r>
+        <w:t xml:space="preserve"> </w:t>
+      </w:r>
+      <w:r>
+        <w:t xml:space="preserve">in Udahamulla: Rs 1,999,440 per perch, High band, both locally and online).</w:t>
+      </w:r>
+    </w:p>
+    <w:p>
+      <w:pPr>
+        <w:pStyle w:val="BodyText"/>
+      </w:pPr>
+      <w:r>
+        <w:t xml:space="preserve">To make the model maintainable rather than a one-off notebook result, a small MLOps pipeline was added:</w:t>
+      </w:r>
+    </w:p>
+    <w:p>
+      <w:pPr>
+        <w:pStyle w:val="SourceCode"/>
+      </w:pPr>
+      <w:r>
+        <w:rPr>
+          <w:rStyle w:val="VerbatimChar"/>
+        </w:rPr>
+        <w:t xml:space="preserve">raw Excel -&gt; src/prepare.py -&gt; clean data -&gt; src/train.py -&gt; candidate model + metrics.json</w:t>
+      </w:r>
+      <w:r>
+        <w:br/>
+      </w:r>
+      <w:r>
+        <w:rPr>
+          <w:rStyle w:val="VerbatimChar"/>
+        </w:rPr>
+        <w:t xml:space="preserve">                                                                  |</w:t>
+      </w:r>
+      <w:r>
+        <w:br/>
+      </w:r>
+      <w:r>
+        <w:rPr>
+          <w:rStyle w:val="VerbatimChar"/>
+        </w:rPr>
+        <w:t xml:space="preserve">                                   src/promote.py (quality gate) &lt;-+</w:t>
+      </w:r>
+      <w:r>
+        <w:br/>
+      </w:r>
+      <w:r>
+        <w:rPr>
+          <w:rStyle w:val="VerbatimChar"/>
+        </w:rPr>
+        <w:t xml:space="preserve">                          R2 &gt;= 0.85 and not worse than deployed by &gt; 0.005?</w:t>
+      </w:r>
+      <w:r>
+        <w:br/>
+      </w:r>
+      <w:r>
+        <w:rPr>
+          <w:rStyle w:val="VerbatimChar"/>
+        </w:rPr>
+        <w:t xml:space="preserve">                            yes -&gt; replace land_price_model.pkl (old one backed up)</w:t>
+      </w:r>
+      <w:r>
+        <w:br/>
+      </w:r>
+      <w:r>
+        <w:rPr>
+          <w:rStyle w:val="VerbatimChar"/>
+        </w:rPr>
+        <w:t xml:space="preserve">                            no  -&gt; reject; deployed model unchanged</w:t>
       </w:r>
     </w:p>
     <w:p>
@@ -8831,19 +8951,52 @@
           <w:b/>
           <w:bCs/>
         </w:rPr>
-        <w:t xml:space="preserve">Asking prices, not sale prices.</w:t>
-      </w:r>
-      <w:r>
-        <w:t xml:space="preserve"> </w:t>
-      </w:r>
-      <w:r>
-        <w:t xml:space="preserve">Advertisements show what sellers hope to get. Actual transaction prices</w:t>
-      </w:r>
-      <w:r>
-        <w:t xml:space="preserve"> </w:t>
-      </w:r>
-      <w:r>
-        <w:t xml:space="preserve">are usually lower and are not public in Sri Lanka.</w:t>
+        <w:t xml:space="preserve">Reproducible retraining.</w:t>
+      </w:r>
+      <w:r>
+        <w:t xml:space="preserve"> </w:t>
+      </w:r>
+      <w:r>
+        <w:rPr>
+          <w:rStyle w:val="VerbatimChar"/>
+        </w:rPr>
+        <w:t xml:space="preserve">run_pipeline.py</w:t>
+      </w:r>
+      <w:r>
+        <w:t xml:space="preserve"> </w:t>
+      </w:r>
+      <w:r>
+        <w:t xml:space="preserve">rebuilds the model from the raw Excel file with the tuned</w:t>
+      </w:r>
+      <w:r>
+        <w:t xml:space="preserve"> </w:t>
+      </w:r>
+      <w:r>
+        <w:t xml:space="preserve">hyperparameters stored in</w:t>
+      </w:r>
+      <w:r>
+        <w:t xml:space="preserve"> </w:t>
+      </w:r>
+      <w:r>
+        <w:rPr>
+          <w:rStyle w:val="VerbatimChar"/>
+        </w:rPr>
+        <w:t xml:space="preserve">config/params.json</w:t>
+      </w:r>
+      <w:r>
+        <w:t xml:space="preserve">, using the same seed, held-out listing and split as the</w:t>
+      </w:r>
+      <w:r>
+        <w:t xml:space="preserve"> </w:t>
+      </w:r>
+      <w:r>
+        <w:t xml:space="preserve">notebooks. It took 4.4 minutes and reproduced the notebook: identical cleaned data, and test R² 0.8659</w:t>
+      </w:r>
+      <w:r>
+        <w:t xml:space="preserve"> </w:t>
+      </w:r>
+      <w:r>
+        <w:t xml:space="preserve">against 0.8661.</w:t>
       </w:r>
     </w:p>
     <w:p>
@@ -8859,47 +9012,25 @@
           <w:b/>
           <w:bCs/>
         </w:rPr>
-        <w:t xml:space="preserve">The data is from 2021.</w:t>
-      </w:r>
-      <w:r>
-        <w:t xml:space="preserve"> </w:t>
-      </w:r>
-      <w:r>
-        <w:t xml:space="preserve">Since then, the 2022 economic crisis and high inflation have changed land prices</w:t>
-      </w:r>
-      <w:r>
-        <w:t xml:space="preserve"> </w:t>
-      </w:r>
-      <w:r>
-        <w:t xml:space="preserve">considerably, so the absolute rupee values are out of date. The</w:t>
-      </w:r>
-      <w:r>
-        <w:t xml:space="preserve"> </w:t>
-      </w:r>
-      <w:r>
-        <w:rPr>
-          <w:b/>
-          <w:bCs/>
-        </w:rPr>
-        <w:t xml:space="preserve">relative</w:t>
-      </w:r>
-      <w:r>
-        <w:t xml:space="preserve"> </w:t>
-      </w:r>
-      <w:r>
-        <w:t xml:space="preserve">patterns (location, size and</w:t>
-      </w:r>
-      <w:r>
-        <w:t xml:space="preserve"> </w:t>
-      </w:r>
-      <w:r>
-        <w:t xml:space="preserve">type effects) are more likely to still hold. The model should be retrained on recent listings before</w:t>
-      </w:r>
-      <w:r>
-        <w:t xml:space="preserve"> </w:t>
-      </w:r>
-      <w:r>
-        <w:t xml:space="preserve">practical use.</w:t>
+        <w:t xml:space="preserve">Quality gate.</w:t>
+      </w:r>
+      <w:r>
+        <w:t xml:space="preserve"> </w:t>
+      </w:r>
+      <w:r>
+        <w:t xml:space="preserve">A retrained model replaces the deployed one only if its test R² is at least 0.85 and not</w:t>
+      </w:r>
+      <w:r>
+        <w:t xml:space="preserve"> </w:t>
+      </w:r>
+      <w:r>
+        <w:t xml:space="preserve">more than 0.005 below the current model. In testing, the gate accepted the real retrained model and rejected</w:t>
+      </w:r>
+      <w:r>
+        <w:t xml:space="preserve"> </w:t>
+      </w:r>
+      <w:r>
+        <w:t xml:space="preserve">candidates with R² 0.80 and 0.858.</w:t>
       </w:r>
     </w:p>
     <w:p>
@@ -8915,25 +9046,25 @@
           <w:b/>
           <w:bCs/>
         </w:rPr>
-        <w:t xml:space="preserve">Location is recorded per area, not per plot</w:t>
-      </w:r>
-      <w:r>
-        <w:t xml:space="preserve"> </w:t>
-      </w:r>
-      <w:r>
-        <w:t xml:space="preserve">(Section 3.7). This is the biggest limitation. Two plots in</w:t>
-      </w:r>
-      <w:r>
-        <w:t xml:space="preserve"> </w:t>
-      </w:r>
-      <w:r>
-        <w:t xml:space="preserve">the same area, one on a main road and one down a narrow lane, look identical to the model. Geocoding each</w:t>
-      </w:r>
-      <w:r>
-        <w:t xml:space="preserve"> </w:t>
-      </w:r>
-      <w:r>
-        <w:t xml:space="preserve">listing would let the 27 location features describe the actual plot.</w:t>
+        <w:t xml:space="preserve">Automated tests.</w:t>
+      </w:r>
+      <w:r>
+        <w:t xml:space="preserve"> </w:t>
+      </w:r>
+      <w:r>
+        <w:t xml:space="preserve">14 tests check the data rules (row count, no duplicates, no leaky columns), the model’s</w:t>
+      </w:r>
+      <w:r>
+        <w:t xml:space="preserve"> </w:t>
+      </w:r>
+      <w:r>
+        <w:t xml:space="preserve">behaviour (the held-out listing reproduces the notebook’s prediction; central Colombo is priced above the</w:t>
+      </w:r>
+      <w:r>
+        <w:t xml:space="preserve"> </w:t>
+      </w:r>
+      <w:r>
+        <w:t xml:space="preserve">suburbs; all predictions are finite) and that the app starts and returns a prediction.</w:t>
       </w:r>
     </w:p>
     <w:p>
@@ -8949,19 +9080,25 @@
           <w:b/>
           <w:bCs/>
         </w:rPr>
-        <w:t xml:space="preserve">Missing plot features</w:t>
-      </w:r>
-      <w:r>
-        <w:t xml:space="preserve"> </w:t>
-      </w:r>
-      <w:r>
-        <w:t xml:space="preserve">such as road frontage, road width, shape, slope and flood risk are known to</w:t>
-      </w:r>
-      <w:r>
-        <w:t xml:space="preserve"> </w:t>
-      </w:r>
-      <w:r>
-        <w:t xml:space="preserve">affect Sri Lankan land prices strongly but are not in the dataset.</w:t>
+        <w:t xml:space="preserve">Continuous integration.</w:t>
+      </w:r>
+      <w:r>
+        <w:t xml:space="preserve"> </w:t>
+      </w:r>
+      <w:r>
+        <w:t xml:space="preserve">A GitHub Actions workflow runs the tests on Linux on every push. The first run</w:t>
+      </w:r>
+      <w:r>
+        <w:t xml:space="preserve"> </w:t>
+      </w:r>
+      <w:r>
+        <w:t xml:space="preserve">passed, confirming that the model trained on Windows loads and predicts correctly with the pinned library</w:t>
+      </w:r>
+      <w:r>
+        <w:t xml:space="preserve"> </w:t>
+      </w:r>
+      <w:r>
+        <w:t xml:space="preserve">versions used by the cloud deployment.</w:t>
       </w:r>
     </w:p>
     <w:p>
@@ -8977,25 +9114,93 @@
           <w:b/>
           <w:bCs/>
         </w:rPr>
-        <w:t xml:space="preserve">Repeated developer listings.</w:t>
-      </w:r>
-      <w:r>
-        <w:t xml:space="preserve"> </w:t>
-      </w:r>
-      <w:r>
-        <w:t xml:space="preserve">Many plots from the same block, advertised at the same price, can appear</w:t>
-      </w:r>
-      <w:r>
-        <w:t xml:space="preserve"> </w:t>
-      </w:r>
-      <w:r>
-        <w:t xml:space="preserve">in both the training and test sets. This makes the seen-area scores somewhat optimistic for genuinely new</w:t>
-      </w:r>
-      <w:r>
-        <w:t xml:space="preserve"> </w:t>
-      </w:r>
-      <w:r>
-        <w:t xml:space="preserve">developments.</w:t>
+        <w:t xml:space="preserve">Retraining on demand.</w:t>
+      </w:r>
+      <w:r>
+        <w:t xml:space="preserve"> </w:t>
+      </w:r>
+      <w:r>
+        <w:t xml:space="preserve">A second workflow, started manually from GitHub’s Actions tab, runs the full</w:t>
+      </w:r>
+      <w:r>
+        <w:t xml:space="preserve"> </w:t>
+      </w:r>
+      <w:r>
+        <w:t xml:space="preserve">pipeline in the cloud and uploads the candidate model and its metrics for review.</w:t>
+      </w:r>
+    </w:p>
+    <w:p>
+      <w:pPr>
+        <w:pStyle w:val="Compact"/>
+        <w:numPr>
+          <w:ilvl w:val="0"/>
+          <w:numId w:val="1013"/>
+        </w:numPr>
+      </w:pPr>
+      <w:r>
+        <w:rPr>
+          <w:b/>
+          <w:bCs/>
+        </w:rPr>
+        <w:t xml:space="preserve">Continuous deployment.</w:t>
+      </w:r>
+      <w:r>
+        <w:t xml:space="preserve"> </w:t>
+      </w:r>
+      <w:r>
+        <w:t xml:space="preserve">Streamlit Community Cloud redeploys the app automatically whenever the</w:t>
+      </w:r>
+      <w:r>
+        <w:t xml:space="preserve"> </w:t>
+      </w:r>
+      <w:r>
+        <w:rPr>
+          <w:rStyle w:val="VerbatimChar"/>
+        </w:rPr>
+        <w:t xml:space="preserve">main</w:t>
+      </w:r>
+      <w:r>
+        <w:t xml:space="preserve"> </w:t>
+      </w:r>
+      <w:r>
+        <w:t xml:space="preserve">branch changes.</w:t>
+      </w:r>
+    </w:p>
+    <w:p>
+      <w:pPr>
+        <w:pStyle w:val="Compact"/>
+        <w:numPr>
+          <w:ilvl w:val="0"/>
+          <w:numId w:val="1013"/>
+        </w:numPr>
+      </w:pPr>
+      <w:r>
+        <w:rPr>
+          <w:b/>
+          <w:bCs/>
+        </w:rPr>
+        <w:t xml:space="preserve">Pinned dependencies.</w:t>
+      </w:r>
+      <w:r>
+        <w:t xml:space="preserve"> </w:t>
+      </w:r>
+      <w:r>
+        <w:rPr>
+          <w:rStyle w:val="VerbatimChar"/>
+        </w:rPr>
+        <w:t xml:space="preserve">requirements.txt</w:t>
+      </w:r>
+      <w:r>
+        <w:t xml:space="preserve"> </w:t>
+      </w:r>
+      <w:r>
+        <w:t xml:space="preserve">fixes the exact library versions, because a pickled model must be</w:t>
+      </w:r>
+      <w:r>
+        <w:t xml:space="preserve"> </w:t>
+      </w:r>
+      <w:r>
+        <w:t xml:space="preserve">loaded with the versions it was trained with.</w:t>
       </w:r>
     </w:p>
     <w:p>
@@ -9005,197 +9210,15 @@
         </w:pict>
       </w:r>
     </w:p>
+    <w:bookmarkEnd w:id="70"/>
     <w:bookmarkEnd w:id="71"/>
-    <w:bookmarkStart w:id="72" w:name="conclusion"/>
+    <w:bookmarkStart w:id="72" w:name="limitations-and-future-work"/>
     <w:p>
       <w:pPr>
         <w:pStyle w:val="Heading2"/>
       </w:pPr>
       <w:r>
-        <w:t xml:space="preserve">9. Conclusion</w:t>
-      </w:r>
-    </w:p>
-    <w:p>
-      <w:pPr>
-        <w:pStyle w:val="FirstParagraph"/>
-      </w:pPr>
-      <w:r>
-        <w:t xml:space="preserve">A model was built to estimate the asking price per perch of land in the Colombo district from 4,275 cleaned</w:t>
-      </w:r>
-      <w:r>
-        <w:t xml:space="preserve"> </w:t>
-      </w:r>
-      <w:r>
-        <w:t xml:space="preserve">listings. Preprocessing corrected a price-scale error in the data, removed duplicates, and handled the</w:t>
-      </w:r>
-      <w:r>
-        <w:t xml:space="preserve"> </w:t>
-      </w:r>
-      <w:r>
-        <w:t xml:space="preserve">heavily skewed target with a log transform, so that only 21 true outliers had to be removed instead of 297</w:t>
-      </w:r>
-      <w:r>
-        <w:t xml:space="preserve"> </w:t>
-      </w:r>
-      <w:r>
-        <w:t xml:space="preserve">genuine high-value listings. Random Forest and XGBoost were tuned instead of used with defaults, which</w:t>
-      </w:r>
-      <w:r>
-        <w:t xml:space="preserve"> </w:t>
-      </w:r>
-      <w:r>
-        <w:t xml:space="preserve">improved R² from about 0.83 to 0.86, and LightGBM, CatBoost and a stacked ensemble were added. The stacked</w:t>
-      </w:r>
-      <w:r>
-        <w:t xml:space="preserve"> </w:t>
-      </w:r>
-      <w:r>
-        <w:t xml:space="preserve">ensemble was selected as the final model on cross-validation, reaching an R² of 0.866 on the log scale and a</w:t>
-      </w:r>
-      <w:r>
-        <w:t xml:space="preserve"> </w:t>
-      </w:r>
-      <w:r>
-        <w:t xml:space="preserve">median error of about 12%. A Random Forest classifier assigned Low, Medium and High price bands with 90.5%</w:t>
-      </w:r>
-      <w:r>
-        <w:t xml:space="preserve"> </w:t>
-      </w:r>
-      <w:r>
-        <w:t xml:space="preserve">accuracy.</w:t>
-      </w:r>
-    </w:p>
-    <w:p>
-      <w:pPr>
-        <w:pStyle w:val="BodyText"/>
-      </w:pPr>
-      <w:r>
-        <w:t xml:space="preserve">The most important finding came from the data rather than the models: the location features are recorded per</w:t>
-      </w:r>
-      <w:r>
-        <w:t xml:space="preserve"> </w:t>
-      </w:r>
-      <w:r>
-        <w:t xml:space="preserve">area, not per plot. As a result,</w:t>
-      </w:r>
-      <w:r>
-        <w:t xml:space="preserve"> </w:t>
-      </w:r>
-      <w:r>
-        <w:rPr>
-          <w:b/>
-          <w:bCs/>
-        </w:rPr>
-        <w:t xml:space="preserve">location (area) explains most of the price</w:t>
-      </w:r>
-      <w:r>
-        <w:t xml:space="preserve">, all well-tuned tree models</w:t>
-      </w:r>
-      <w:r>
-        <w:t xml:space="preserve"> </w:t>
-      </w:r>
-      <w:r>
-        <w:t xml:space="preserve">perform almost identically, and accuracy is limited by the data rather than by the choice of algorithm.</w:t>
-      </w:r>
-      <w:r>
-        <w:t xml:space="preserve"> </w:t>
-      </w:r>
-      <w:r>
-        <w:t xml:space="preserve">SHAP confirmed this from inside the model: location accounts for 87% of its decisions. SHAP and LIME</w:t>
-      </w:r>
-      <w:r>
-        <w:t xml:space="preserve"> </w:t>
-      </w:r>
-      <w:r>
-        <w:t xml:space="preserve">explanations of the held-out listing agreed on its main drivers (distance from the city, the area itself, and</w:t>
-      </w:r>
-      <w:r>
-        <w:t xml:space="preserve"> </w:t>
-      </w:r>
-      <w:r>
-        <w:t xml:space="preserve">distance to good schools). Better</w:t>
-      </w:r>
-      <w:r>
-        <w:t xml:space="preserve"> </w:t>
-      </w:r>
-      <w:r>
-        <w:t xml:space="preserve">data, meaning per-plot coordinates, recent prices and plot features such as road access, would improve the</w:t>
-      </w:r>
-      <w:r>
-        <w:t xml:space="preserve"> </w:t>
-      </w:r>
-      <w:r>
-        <w:t xml:space="preserve">model more than any further tuning.</w:t>
-      </w:r>
-    </w:p>
-    <w:p>
-      <w:r>
-        <w:pict>
-          <v:rect style="width:0;height:1.5pt" o:hralign="center" o:hrstd="t" o:hr="t"/>
-        </w:pict>
-      </w:r>
-    </w:p>
-    <w:bookmarkEnd w:id="72"/>
-    <w:bookmarkStart w:id="73" w:name="use-of-ai-tools"/>
-    <w:p>
-      <w:pPr>
-        <w:pStyle w:val="Heading2"/>
-      </w:pPr>
-      <w:r>
-        <w:t xml:space="preserve">Use of AI Tools</w:t>
-      </w:r>
-    </w:p>
-    <w:p>
-      <w:pPr>
-        <w:pStyle w:val="FirstParagraph"/>
-      </w:pPr>
-      <w:r>
-        <w:t xml:space="preserve">[</w:t>
-      </w:r>
-      <w:r>
-        <w:rPr>
-          <w:b/>
-          <w:bCs/>
-        </w:rPr>
-        <w:t xml:space="preserve">To review and adjust before submission.</w:t>
-      </w:r>
-      <w:r>
-        <w:t xml:space="preserve">] In line with the module guideline, AI assistance (Claude) was</w:t>
-      </w:r>
-      <w:r>
-        <w:t xml:space="preserve"> </w:t>
-      </w:r>
-      <w:r>
-        <w:t xml:space="preserve">used for coding support and for generating the front-end application. The modelling decisions, results and</w:t>
-      </w:r>
-      <w:r>
-        <w:t xml:space="preserve"> </w:t>
-      </w:r>
-      <w:r>
-        <w:t xml:space="preserve">interpretation were reviewed and understood by the author, and all numbers in this report come from the</w:t>
-      </w:r>
-      <w:r>
-        <w:t xml:space="preserve"> </w:t>
-      </w:r>
-      <w:r>
-        <w:t xml:space="preserve">accompanying notebooks.</w:t>
-      </w:r>
-    </w:p>
-    <w:p>
-      <w:r>
-        <w:pict>
-          <v:rect style="width:0;height:1.5pt" o:hralign="center" o:hrstd="t" o:hr="t"/>
-        </w:pict>
-      </w:r>
-    </w:p>
-    <w:bookmarkEnd w:id="73"/>
-    <w:bookmarkStart w:id="74" w:name="references"/>
-    <w:p>
-      <w:pPr>
-        <w:pStyle w:val="Heading2"/>
-      </w:pPr>
-      <w:r>
-        <w:t xml:space="preserve">References</w:t>
+        <w:t xml:space="preserve">8. Limitations and Future Work</w:t>
       </w:r>
     </w:p>
     <w:p>
@@ -9207,20 +9230,23 @@
         </w:numPr>
       </w:pPr>
       <w:r>
-        <w:t xml:space="preserve">Breiman, L. (2001). Random Forests.</w:t>
-      </w:r>
-      <w:r>
-        <w:t xml:space="preserve"> </w:t>
-      </w:r>
-      <w:r>
-        <w:rPr>
-          <w:i/>
-          <w:iCs/>
-        </w:rPr>
-        <w:t xml:space="preserve">Machine Learning</w:t>
-      </w:r>
-      <w:r>
-        <w:t xml:space="preserve">, 45(1), 5-32.</w:t>
+        <w:rPr>
+          <w:b/>
+          <w:bCs/>
+        </w:rPr>
+        <w:t xml:space="preserve">Asking prices, not sale prices.</w:t>
+      </w:r>
+      <w:r>
+        <w:t xml:space="preserve"> </w:t>
+      </w:r>
+      <w:r>
+        <w:t xml:space="preserve">Advertisements show what sellers hope to get. Actual transaction prices</w:t>
+      </w:r>
+      <w:r>
+        <w:t xml:space="preserve"> </w:t>
+      </w:r>
+      <w:r>
+        <w:t xml:space="preserve">are usually lower and are not public in Sri Lanka.</w:t>
       </w:r>
     </w:p>
     <w:p>
@@ -9232,34 +9258,51 @@
         </w:numPr>
       </w:pPr>
       <w:r>
-        <w:t xml:space="preserve">Chen, T. and Guestrin, C. (2016). XGBoost: A Scalable Tree Boosting System.</w:t>
-      </w:r>
-      <w:r>
-        <w:t xml:space="preserve"> </w:t>
-      </w:r>
-      <w:r>
-        <w:rPr>
-          <w:i/>
-          <w:iCs/>
-        </w:rPr>
-        <w:t xml:space="preserve">Proceedings of the 22nd ACM</w:t>
-      </w:r>
-      <w:r>
-        <w:rPr>
-          <w:i/>
-          <w:iCs/>
-        </w:rPr>
-        <w:t xml:space="preserve"> </w:t>
-      </w:r>
-      <w:r>
-        <w:rPr>
-          <w:i/>
-          <w:iCs/>
-        </w:rPr>
-        <w:t xml:space="preserve">SIGKDD International Conference on Knowledge Discovery and Data Mining</w:t>
-      </w:r>
-      <w:r>
-        <w:t xml:space="preserve">, 785-794.</w:t>
+        <w:rPr>
+          <w:b/>
+          <w:bCs/>
+        </w:rPr>
+        <w:t xml:space="preserve">The data is from 2021.</w:t>
+      </w:r>
+      <w:r>
+        <w:t xml:space="preserve"> </w:t>
+      </w:r>
+      <w:r>
+        <w:t xml:space="preserve">Since then, the 2022 economic crisis and high inflation have changed land prices</w:t>
+      </w:r>
+      <w:r>
+        <w:t xml:space="preserve"> </w:t>
+      </w:r>
+      <w:r>
+        <w:t xml:space="preserve">considerably, so the absolute rupee values are out of date. The</w:t>
+      </w:r>
+      <w:r>
+        <w:t xml:space="preserve"> </w:t>
+      </w:r>
+      <w:r>
+        <w:rPr>
+          <w:b/>
+          <w:bCs/>
+        </w:rPr>
+        <w:t xml:space="preserve">relative</w:t>
+      </w:r>
+      <w:r>
+        <w:t xml:space="preserve"> </w:t>
+      </w:r>
+      <w:r>
+        <w:t xml:space="preserve">patterns (location, size and</w:t>
+      </w:r>
+      <w:r>
+        <w:t xml:space="preserve"> </w:t>
+      </w:r>
+      <w:r>
+        <w:t xml:space="preserve">type effects) are more likely to still hold. The model should be retrained on recent listings before</w:t>
+      </w:r>
+      <w:r>
+        <w:t xml:space="preserve"> </w:t>
+      </w:r>
+      <w:r>
+        <w:t xml:space="preserve">practical use.</w:t>
       </w:r>
     </w:p>
     <w:p>
@@ -9271,34 +9314,29 @@
         </w:numPr>
       </w:pPr>
       <w:r>
-        <w:t xml:space="preserve">Ke, G. et al. (2017). LightGBM: A Highly Efficient Gradient Boosting Decision Tree.</w:t>
-      </w:r>
-      <w:r>
-        <w:t xml:space="preserve"> </w:t>
-      </w:r>
-      <w:r>
-        <w:rPr>
-          <w:i/>
-          <w:iCs/>
-        </w:rPr>
-        <w:t xml:space="preserve">Advances in Neural</w:t>
-      </w:r>
-      <w:r>
-        <w:rPr>
-          <w:i/>
-          <w:iCs/>
-        </w:rPr>
-        <w:t xml:space="preserve"> </w:t>
-      </w:r>
-      <w:r>
-        <w:rPr>
-          <w:i/>
-          <w:iCs/>
-        </w:rPr>
-        <w:t xml:space="preserve">Information Processing Systems 30</w:t>
-      </w:r>
-      <w:r>
-        <w:t xml:space="preserve">.</w:t>
+        <w:rPr>
+          <w:b/>
+          <w:bCs/>
+        </w:rPr>
+        <w:t xml:space="preserve">Location is recorded per area, not per plot</w:t>
+      </w:r>
+      <w:r>
+        <w:t xml:space="preserve"> </w:t>
+      </w:r>
+      <w:r>
+        <w:t xml:space="preserve">(Section 3.7). This is the biggest limitation. Two plots in</w:t>
+      </w:r>
+      <w:r>
+        <w:t xml:space="preserve"> </w:t>
+      </w:r>
+      <w:r>
+        <w:t xml:space="preserve">the same area, one on a main road and one down a narrow lane, look identical to the model. Geocoding each</w:t>
+      </w:r>
+      <w:r>
+        <w:t xml:space="preserve"> </w:t>
+      </w:r>
+      <w:r>
+        <w:t xml:space="preserve">listing would let the 27 location features describe the actual plot.</w:t>
       </w:r>
     </w:p>
     <w:p>
@@ -9310,34 +9348,23 @@
         </w:numPr>
       </w:pPr>
       <w:r>
-        <w:t xml:space="preserve">Prokhorenkova, L. et al. (2018). CatBoost: unbiased boosting with categorical features.</w:t>
-      </w:r>
-      <w:r>
-        <w:t xml:space="preserve"> </w:t>
-      </w:r>
-      <w:r>
-        <w:rPr>
-          <w:i/>
-          <w:iCs/>
-        </w:rPr>
-        <w:t xml:space="preserve">Advances in Neural</w:t>
-      </w:r>
-      <w:r>
-        <w:rPr>
-          <w:i/>
-          <w:iCs/>
-        </w:rPr>
-        <w:t xml:space="preserve"> </w:t>
-      </w:r>
-      <w:r>
-        <w:rPr>
-          <w:i/>
-          <w:iCs/>
-        </w:rPr>
-        <w:t xml:space="preserve">Information Processing Systems 31</w:t>
-      </w:r>
-      <w:r>
-        <w:t xml:space="preserve">.</w:t>
+        <w:rPr>
+          <w:b/>
+          <w:bCs/>
+        </w:rPr>
+        <w:t xml:space="preserve">Missing plot features</w:t>
+      </w:r>
+      <w:r>
+        <w:t xml:space="preserve"> </w:t>
+      </w:r>
+      <w:r>
+        <w:t xml:space="preserve">such as road frontage, road width, shape, slope and flood risk are known to</w:t>
+      </w:r>
+      <w:r>
+        <w:t xml:space="preserve"> </w:t>
+      </w:r>
+      <w:r>
+        <w:t xml:space="preserve">affect Sri Lankan land prices strongly but are not in the dataset.</w:t>
       </w:r>
     </w:p>
     <w:p>
@@ -9349,34 +9376,229 @@
         </w:numPr>
       </w:pPr>
       <w:r>
-        <w:t xml:space="preserve">Pedregosa, F. et al. (2011). Scikit-learn: Machine Learning in Python.</w:t>
-      </w:r>
-      <w:r>
-        <w:t xml:space="preserve"> </w:t>
-      </w:r>
-      <w:r>
-        <w:rPr>
-          <w:i/>
-          <w:iCs/>
-        </w:rPr>
-        <w:t xml:space="preserve">Journal of Machine Learning</w:t>
-      </w:r>
-      <w:r>
-        <w:rPr>
-          <w:i/>
-          <w:iCs/>
-        </w:rPr>
-        <w:t xml:space="preserve"> </w:t>
-      </w:r>
-      <w:r>
-        <w:rPr>
-          <w:i/>
-          <w:iCs/>
-        </w:rPr>
-        <w:t xml:space="preserve">Research</w:t>
-      </w:r>
-      <w:r>
-        <w:t xml:space="preserve">, 12, 2825-2830.</w:t>
+        <w:rPr>
+          <w:b/>
+          <w:bCs/>
+        </w:rPr>
+        <w:t xml:space="preserve">Repeated developer listings.</w:t>
+      </w:r>
+      <w:r>
+        <w:t xml:space="preserve"> </w:t>
+      </w:r>
+      <w:r>
+        <w:t xml:space="preserve">Many plots from the same block, advertised at the same price, can appear</w:t>
+      </w:r>
+      <w:r>
+        <w:t xml:space="preserve"> </w:t>
+      </w:r>
+      <w:r>
+        <w:t xml:space="preserve">in both the training and test sets. This makes the seen-area scores somewhat optimistic for genuinely new</w:t>
+      </w:r>
+      <w:r>
+        <w:t xml:space="preserve"> </w:t>
+      </w:r>
+      <w:r>
+        <w:t xml:space="preserve">developments.</w:t>
+      </w:r>
+    </w:p>
+    <w:p>
+      <w:r>
+        <w:pict>
+          <v:rect style="width:0;height:1.5pt" o:hralign="center" o:hrstd="t" o:hr="t"/>
+        </w:pict>
+      </w:r>
+    </w:p>
+    <w:bookmarkEnd w:id="72"/>
+    <w:bookmarkStart w:id="73" w:name="conclusion"/>
+    <w:p>
+      <w:pPr>
+        <w:pStyle w:val="Heading2"/>
+      </w:pPr>
+      <w:r>
+        <w:t xml:space="preserve">9. Conclusion</w:t>
+      </w:r>
+    </w:p>
+    <w:p>
+      <w:pPr>
+        <w:pStyle w:val="FirstParagraph"/>
+      </w:pPr>
+      <w:r>
+        <w:t xml:space="preserve">A model was built to estimate the asking price per perch of land in the Colombo district from 4,275 cleaned</w:t>
+      </w:r>
+      <w:r>
+        <w:t xml:space="preserve"> </w:t>
+      </w:r>
+      <w:r>
+        <w:t xml:space="preserve">listings. Preprocessing corrected a price-scale error in the data, removed duplicates, and handled the</w:t>
+      </w:r>
+      <w:r>
+        <w:t xml:space="preserve"> </w:t>
+      </w:r>
+      <w:r>
+        <w:t xml:space="preserve">heavily skewed target with a log transform, so that only 21 true outliers had to be removed instead of 297</w:t>
+      </w:r>
+      <w:r>
+        <w:t xml:space="preserve"> </w:t>
+      </w:r>
+      <w:r>
+        <w:t xml:space="preserve">genuine high-value listings. Random Forest and XGBoost were tuned instead of used with defaults, which</w:t>
+      </w:r>
+      <w:r>
+        <w:t xml:space="preserve"> </w:t>
+      </w:r>
+      <w:r>
+        <w:t xml:space="preserve">improved R² from about 0.83 to 0.86, and LightGBM, CatBoost and a stacked ensemble were added. The stacked</w:t>
+      </w:r>
+      <w:r>
+        <w:t xml:space="preserve"> </w:t>
+      </w:r>
+      <w:r>
+        <w:t xml:space="preserve">ensemble was selected as the final model on cross-validation, reaching an R² of 0.866 on the log scale and a</w:t>
+      </w:r>
+      <w:r>
+        <w:t xml:space="preserve"> </w:t>
+      </w:r>
+      <w:r>
+        <w:t xml:space="preserve">median error of about 12%. A Random Forest classifier assigned Low, Medium and High price bands with 90.5%</w:t>
+      </w:r>
+      <w:r>
+        <w:t xml:space="preserve"> </w:t>
+      </w:r>
+      <w:r>
+        <w:t xml:space="preserve">accuracy.</w:t>
+      </w:r>
+    </w:p>
+    <w:p>
+      <w:pPr>
+        <w:pStyle w:val="BodyText"/>
+      </w:pPr>
+      <w:r>
+        <w:t xml:space="preserve">The most important finding came from the data rather than the models: the location features are recorded per</w:t>
+      </w:r>
+      <w:r>
+        <w:t xml:space="preserve"> </w:t>
+      </w:r>
+      <w:r>
+        <w:t xml:space="preserve">area, not per plot. As a result,</w:t>
+      </w:r>
+      <w:r>
+        <w:t xml:space="preserve"> </w:t>
+      </w:r>
+      <w:r>
+        <w:rPr>
+          <w:b/>
+          <w:bCs/>
+        </w:rPr>
+        <w:t xml:space="preserve">location (area) explains most of the price</w:t>
+      </w:r>
+      <w:r>
+        <w:t xml:space="preserve">, all well-tuned tree models</w:t>
+      </w:r>
+      <w:r>
+        <w:t xml:space="preserve"> </w:t>
+      </w:r>
+      <w:r>
+        <w:t xml:space="preserve">perform almost identically, and accuracy is limited by the data rather than by the choice of algorithm.</w:t>
+      </w:r>
+      <w:r>
+        <w:t xml:space="preserve"> </w:t>
+      </w:r>
+      <w:r>
+        <w:t xml:space="preserve">SHAP confirmed this from inside the model: location accounts for 87% of its decisions. SHAP and LIME</w:t>
+      </w:r>
+      <w:r>
+        <w:t xml:space="preserve"> </w:t>
+      </w:r>
+      <w:r>
+        <w:t xml:space="preserve">explanations of the held-out listing agreed on its main drivers (distance from the city, the area itself, and</w:t>
+      </w:r>
+      <w:r>
+        <w:t xml:space="preserve"> </w:t>
+      </w:r>
+      <w:r>
+        <w:t xml:space="preserve">distance to good schools). Better</w:t>
+      </w:r>
+      <w:r>
+        <w:t xml:space="preserve"> </w:t>
+      </w:r>
+      <w:r>
+        <w:t xml:space="preserve">data, meaning per-plot coordinates, recent prices and plot features such as road access, would improve the</w:t>
+      </w:r>
+      <w:r>
+        <w:t xml:space="preserve"> </w:t>
+      </w:r>
+      <w:r>
+        <w:t xml:space="preserve">model more than any further tuning.</w:t>
+      </w:r>
+    </w:p>
+    <w:p>
+      <w:r>
+        <w:pict>
+          <v:rect style="width:0;height:1.5pt" o:hralign="center" o:hrstd="t" o:hr="t"/>
+        </w:pict>
+      </w:r>
+    </w:p>
+    <w:bookmarkEnd w:id="73"/>
+    <w:bookmarkStart w:id="74" w:name="use-of-ai-tools"/>
+    <w:p>
+      <w:pPr>
+        <w:pStyle w:val="Heading2"/>
+      </w:pPr>
+      <w:r>
+        <w:t xml:space="preserve">Use of AI Tools</w:t>
+      </w:r>
+    </w:p>
+    <w:p>
+      <w:pPr>
+        <w:pStyle w:val="FirstParagraph"/>
+      </w:pPr>
+      <w:r>
+        <w:t xml:space="preserve">[</w:t>
+      </w:r>
+      <w:r>
+        <w:rPr>
+          <w:b/>
+          <w:bCs/>
+        </w:rPr>
+        <w:t xml:space="preserve">To review and adjust before submission.</w:t>
+      </w:r>
+      <w:r>
+        <w:t xml:space="preserve">] In line with the module guideline, AI assistance (Claude) was</w:t>
+      </w:r>
+      <w:r>
+        <w:t xml:space="preserve"> </w:t>
+      </w:r>
+      <w:r>
+        <w:t xml:space="preserve">used for coding support and for generating the front-end application. The modelling decisions, results and</w:t>
+      </w:r>
+      <w:r>
+        <w:t xml:space="preserve"> </w:t>
+      </w:r>
+      <w:r>
+        <w:t xml:space="preserve">interpretation were reviewed and understood by the author, and all numbers in this report come from the</w:t>
+      </w:r>
+      <w:r>
+        <w:t xml:space="preserve"> </w:t>
+      </w:r>
+      <w:r>
+        <w:t xml:space="preserve">accompanying notebooks.</w:t>
+      </w:r>
+    </w:p>
+    <w:p>
+      <w:r>
+        <w:pict>
+          <v:rect style="width:0;height:1.5pt" o:hralign="center" o:hrstd="t" o:hr="t"/>
+        </w:pict>
+      </w:r>
+    </w:p>
+    <w:bookmarkEnd w:id="74"/>
+    <w:bookmarkStart w:id="75" w:name="references"/>
+    <w:p>
+      <w:pPr>
+        <w:pStyle w:val="Heading2"/>
+      </w:pPr>
+      <w:r>
+        <w:t xml:space="preserve">References</w:t>
       </w:r>
     </w:p>
     <w:p>
@@ -9384,11 +9606,11 @@
         <w:pStyle w:val="Compact"/>
         <w:numPr>
           <w:ilvl w:val="0"/>
-          <w:numId w:val="1014"/>
+          <w:numId w:val="1015"/>
         </w:numPr>
       </w:pPr>
       <w:r>
-        <w:t xml:space="preserve">ruchiraayeshmantha (n.d.).</w:t>
+        <w:t xml:space="preserve">Breiman, L. (2001). Random Forests.</w:t>
       </w:r>
       <w:r>
         <w:t xml:space="preserve"> </w:t>
@@ -9398,19 +9620,10 @@
           <w:i/>
           <w:iCs/>
         </w:rPr>
-        <w:t xml:space="preserve">Land prices of Colombo district</w:t>
-      </w:r>
-      <w:r>
-        <w:t xml:space="preserve"> </w:t>
-      </w:r>
-      <w:r>
-        <w:t xml:space="preserve">[Dataset]. Kaggle.</w:t>
-      </w:r>
-      <w:r>
-        <w:t xml:space="preserve"> </w:t>
-      </w:r>
-      <w:r>
-        <w:t xml:space="preserve">https://www.kaggle.com/datasets/ruchiraayeshmantha/land-prices-of-colombo-district (accessed 8 October 2026).</w:t>
+        <w:t xml:space="preserve">Machine Learning</w:t>
+      </w:r>
+      <w:r>
+        <w:t xml:space="preserve">, 45(1), 5-32.</w:t>
       </w:r>
     </w:p>
     <w:p>
@@ -9418,11 +9631,11 @@
         <w:pStyle w:val="Compact"/>
         <w:numPr>
           <w:ilvl w:val="0"/>
-          <w:numId w:val="1014"/>
+          <w:numId w:val="1015"/>
         </w:numPr>
       </w:pPr>
       <w:r>
-        <w:t xml:space="preserve">Lundberg, S. M. and Lee, S.-I. (2017). A Unified Approach to Interpreting Model Predictions.</w:t>
+        <w:t xml:space="preserve">Chen, T. and Guestrin, C. (2016). XGBoost: A Scalable Tree Boosting System.</w:t>
       </w:r>
       <w:r>
         <w:t xml:space="preserve"> </w:t>
@@ -9432,7 +9645,7 @@
           <w:i/>
           <w:iCs/>
         </w:rPr>
-        <w:t xml:space="preserve">Advances in</w:t>
+        <w:t xml:space="preserve">Proceedings of the 22nd ACM</w:t>
       </w:r>
       <w:r>
         <w:rPr>
@@ -9446,10 +9659,10 @@
           <w:i/>
           <w:iCs/>
         </w:rPr>
-        <w:t xml:space="preserve">Neural Information Processing Systems 30</w:t>
-      </w:r>
-      <w:r>
-        <w:t xml:space="preserve">.</w:t>
+        <w:t xml:space="preserve">SIGKDD International Conference on Knowledge Discovery and Data Mining</w:t>
+      </w:r>
+      <w:r>
+        <w:t xml:space="preserve">, 785-794.</w:t>
       </w:r>
     </w:p>
     <w:p>
@@ -9457,26 +9670,11 @@
         <w:pStyle w:val="Compact"/>
         <w:numPr>
           <w:ilvl w:val="0"/>
-          <w:numId w:val="1014"/>
+          <w:numId w:val="1015"/>
         </w:numPr>
       </w:pPr>
       <w:r>
-        <w:t xml:space="preserve">Ribeiro, M. T., Singh, S. and Guestrin, C. (2016).</w:t>
-      </w:r>
-      <w:r>
-        <w:t xml:space="preserve"> </w:t>
-      </w:r>
-      <w:r>
-        <w:t xml:space="preserve">“Why Should I Trust You?”</w:t>
-      </w:r>
-      <w:r>
-        <w:t xml:space="preserve">: Explaining the Predictions of</w:t>
-      </w:r>
-      <w:r>
-        <w:t xml:space="preserve"> </w:t>
-      </w:r>
-      <w:r>
-        <w:t xml:space="preserve">Any Classifier.</w:t>
+        <w:t xml:space="preserve">Ke, G. et al. (2017). LightGBM: A Highly Efficient Gradient Boosting Decision Tree.</w:t>
       </w:r>
       <w:r>
         <w:t xml:space="preserve"> </w:t>
@@ -9486,7 +9684,7 @@
           <w:i/>
           <w:iCs/>
         </w:rPr>
-        <w:t xml:space="preserve">Proceedings of the 22nd ACM SIGKDD International Conference on Knowledge Discovery and Data</w:t>
+        <w:t xml:space="preserve">Advances in Neural</w:t>
       </w:r>
       <w:r>
         <w:rPr>
@@ -9500,10 +9698,10 @@
           <w:i/>
           <w:iCs/>
         </w:rPr>
-        <w:t xml:space="preserve">Mining</w:t>
-      </w:r>
-      <w:r>
-        <w:t xml:space="preserve">, 1135-1144.</w:t>
+        <w:t xml:space="preserve">Information Processing Systems 30</w:t>
+      </w:r>
+      <w:r>
+        <w:t xml:space="preserve">.</w:t>
       </w:r>
     </w:p>
     <w:p>
@@ -9511,10 +9709,215 @@
         <w:pStyle w:val="Compact"/>
         <w:numPr>
           <w:ilvl w:val="0"/>
-          <w:numId w:val="1014"/>
+          <w:numId w:val="1015"/>
         </w:numPr>
       </w:pPr>
       <w:r>
+        <w:t xml:space="preserve">Prokhorenkova, L. et al. (2018). CatBoost: unbiased boosting with categorical features.</w:t>
+      </w:r>
+      <w:r>
+        <w:t xml:space="preserve"> </w:t>
+      </w:r>
+      <w:r>
+        <w:rPr>
+          <w:i/>
+          <w:iCs/>
+        </w:rPr>
+        <w:t xml:space="preserve">Advances in Neural</w:t>
+      </w:r>
+      <w:r>
+        <w:rPr>
+          <w:i/>
+          <w:iCs/>
+        </w:rPr>
+        <w:t xml:space="preserve"> </w:t>
+      </w:r>
+      <w:r>
+        <w:rPr>
+          <w:i/>
+          <w:iCs/>
+        </w:rPr>
+        <w:t xml:space="preserve">Information Processing Systems 31</w:t>
+      </w:r>
+      <w:r>
+        <w:t xml:space="preserve">.</w:t>
+      </w:r>
+    </w:p>
+    <w:p>
+      <w:pPr>
+        <w:pStyle w:val="Compact"/>
+        <w:numPr>
+          <w:ilvl w:val="0"/>
+          <w:numId w:val="1015"/>
+        </w:numPr>
+      </w:pPr>
+      <w:r>
+        <w:t xml:space="preserve">Pedregosa, F. et al. (2011). Scikit-learn: Machine Learning in Python.</w:t>
+      </w:r>
+      <w:r>
+        <w:t xml:space="preserve"> </w:t>
+      </w:r>
+      <w:r>
+        <w:rPr>
+          <w:i/>
+          <w:iCs/>
+        </w:rPr>
+        <w:t xml:space="preserve">Journal of Machine Learning</w:t>
+      </w:r>
+      <w:r>
+        <w:rPr>
+          <w:i/>
+          <w:iCs/>
+        </w:rPr>
+        <w:t xml:space="preserve"> </w:t>
+      </w:r>
+      <w:r>
+        <w:rPr>
+          <w:i/>
+          <w:iCs/>
+        </w:rPr>
+        <w:t xml:space="preserve">Research</w:t>
+      </w:r>
+      <w:r>
+        <w:t xml:space="preserve">, 12, 2825-2830.</w:t>
+      </w:r>
+    </w:p>
+    <w:p>
+      <w:pPr>
+        <w:pStyle w:val="Compact"/>
+        <w:numPr>
+          <w:ilvl w:val="0"/>
+          <w:numId w:val="1015"/>
+        </w:numPr>
+      </w:pPr>
+      <w:r>
+        <w:t xml:space="preserve">ruchiraayeshmantha (n.d.).</w:t>
+      </w:r>
+      <w:r>
+        <w:t xml:space="preserve"> </w:t>
+      </w:r>
+      <w:r>
+        <w:rPr>
+          <w:i/>
+          <w:iCs/>
+        </w:rPr>
+        <w:t xml:space="preserve">Land prices of Colombo district</w:t>
+      </w:r>
+      <w:r>
+        <w:t xml:space="preserve"> </w:t>
+      </w:r>
+      <w:r>
+        <w:t xml:space="preserve">[Dataset]. Kaggle.</w:t>
+      </w:r>
+      <w:r>
+        <w:t xml:space="preserve"> </w:t>
+      </w:r>
+      <w:r>
+        <w:t xml:space="preserve">https://www.kaggle.com/datasets/ruchiraayeshmantha/land-prices-of-colombo-district (accessed 8 October 2026).</w:t>
+      </w:r>
+    </w:p>
+    <w:p>
+      <w:pPr>
+        <w:pStyle w:val="Compact"/>
+        <w:numPr>
+          <w:ilvl w:val="0"/>
+          <w:numId w:val="1015"/>
+        </w:numPr>
+      </w:pPr>
+      <w:r>
+        <w:t xml:space="preserve">Lundberg, S. M. and Lee, S.-I. (2017). A Unified Approach to Interpreting Model Predictions.</w:t>
+      </w:r>
+      <w:r>
+        <w:t xml:space="preserve"> </w:t>
+      </w:r>
+      <w:r>
+        <w:rPr>
+          <w:i/>
+          <w:iCs/>
+        </w:rPr>
+        <w:t xml:space="preserve">Advances in</w:t>
+      </w:r>
+      <w:r>
+        <w:rPr>
+          <w:i/>
+          <w:iCs/>
+        </w:rPr>
+        <w:t xml:space="preserve"> </w:t>
+      </w:r>
+      <w:r>
+        <w:rPr>
+          <w:i/>
+          <w:iCs/>
+        </w:rPr>
+        <w:t xml:space="preserve">Neural Information Processing Systems 30</w:t>
+      </w:r>
+      <w:r>
+        <w:t xml:space="preserve">.</w:t>
+      </w:r>
+    </w:p>
+    <w:p>
+      <w:pPr>
+        <w:pStyle w:val="Compact"/>
+        <w:numPr>
+          <w:ilvl w:val="0"/>
+          <w:numId w:val="1015"/>
+        </w:numPr>
+      </w:pPr>
+      <w:r>
+        <w:t xml:space="preserve">Ribeiro, M. T., Singh, S. and Guestrin, C. (2016).</w:t>
+      </w:r>
+      <w:r>
+        <w:t xml:space="preserve"> </w:t>
+      </w:r>
+      <w:r>
+        <w:t xml:space="preserve">“Why Should I Trust You?”</w:t>
+      </w:r>
+      <w:r>
+        <w:t xml:space="preserve">: Explaining the Predictions of</w:t>
+      </w:r>
+      <w:r>
+        <w:t xml:space="preserve"> </w:t>
+      </w:r>
+      <w:r>
+        <w:t xml:space="preserve">Any Classifier.</w:t>
+      </w:r>
+      <w:r>
+        <w:t xml:space="preserve"> </w:t>
+      </w:r>
+      <w:r>
+        <w:rPr>
+          <w:i/>
+          <w:iCs/>
+        </w:rPr>
+        <w:t xml:space="preserve">Proceedings of the 22nd ACM SIGKDD International Conference on Knowledge Discovery and Data</w:t>
+      </w:r>
+      <w:r>
+        <w:rPr>
+          <w:i/>
+          <w:iCs/>
+        </w:rPr>
+        <w:t xml:space="preserve"> </w:t>
+      </w:r>
+      <w:r>
+        <w:rPr>
+          <w:i/>
+          <w:iCs/>
+        </w:rPr>
+        <w:t xml:space="preserve">Mining</w:t>
+      </w:r>
+      <w:r>
+        <w:t xml:space="preserve">, 1135-1144.</w:t>
+      </w:r>
+    </w:p>
+    <w:p>
+      <w:pPr>
+        <w:pStyle w:val="Compact"/>
+        <w:numPr>
+          <w:ilvl w:val="0"/>
+          <w:numId w:val="1015"/>
+        </w:numPr>
+      </w:pPr>
+      <w:r>
         <w:t xml:space="preserve">IT5514 Applied Machine Learning lecture notes and lab sheets: Decision Trees and Random Forest, XGBoost,</w:t>
       </w:r>
       <w:r>
@@ -9524,8 +9927,8 @@
         <w:t xml:space="preserve">and the feature engineering lab (IQR outlier method).</w:t>
       </w:r>
     </w:p>
-    <w:bookmarkEnd w:id="74"/>
     <w:bookmarkEnd w:id="75"/>
+    <w:bookmarkEnd w:id="76"/>
     <w:sectPr>
       <w:footnotePr>
         <w:numRestart w:val="eachSect"/>
@@ -10002,6 +10405,9 @@
     <w:abstractNumId w:val="991"/>
   </w:num>
   <w:num w:numId="1014">
+    <w:abstractNumId w:val="991"/>
+  </w:num>
+  <w:num w:numId="1015">
     <w:abstractNumId w:val="99411"/>
     <w:lvlOverride w:ilvl="0">
       <w:startOverride w:val="1"/>

</xml_diff>

<commit_message>
Add GitHub link to report title page; latest presentation; remove outdated overview page
</commit_message>
<xml_diff>
--- a/Report.docx
+++ b/Report.docx
@@ -94,6 +94,24 @@
       </w:r>
       <w:r>
         <w:t xml:space="preserve">269179J</w:t>
+      </w:r>
+    </w:p>
+    <w:p>
+      <w:pPr>
+        <w:pStyle w:val="BodyText"/>
+      </w:pPr>
+      <w:r>
+        <w:rPr>
+          <w:b/>
+          <w:bCs/>
+        </w:rPr>
+        <w:t xml:space="preserve">GitHub repository:</w:t>
+      </w:r>
+      <w:r>
+        <w:t xml:space="preserve"> </w:t>
+      </w:r>
+      <w:r>
+        <w:t xml:space="preserve">https://github.com/amalr-12/colombo-land-price-ml</w:t>
       </w:r>
     </w:p>
     <w:p>

</xml_diff>